<commit_message>
aios(2026-10-28): C5 final - 26 screenshots + full Word doc rebuild
- Added 4 new screenshots (23-26): Shopify order verification,
  UUID not found, G&Y conversion settings, fix applied (empty GA4 field)
- Rebuilt Word doc with all 26 steps fully documented
- Screenshots folder complete: 26 files, all named and ordered
- Word doc includes: investigation, double firing proof, Shopify
  order verification, root cause, fix applied, verification plan

Co-Authored-By: Claude Sonnet 4.6 <noreply@anthropic.com>
</commit_message>
<xml_diff>
--- a/bot-tasks/C5-ga4-tracking/C5-GA4-Tracking-Investigation-2026-10-28-FINAL.docx
+++ b/bot-tasks/C5-ga4-tracking/C5-GA4-Tracking-Investigation-2026-10-28-FINAL.docx
@@ -46,13 +46,23 @@
         <w:rPr>
           <w:b/>
         </w:rPr>
+        <w:t>Investigated by:</w:t>
+      </w:r>
+      <w:r>
+        <w:t xml:space="preserve"> Piranavan</w:t>
+        <w:br/>
+      </w:r>
+      <w:r>
+        <w:rPr>
+          <w:b/>
+        </w:rPr>
         <w:t>Status:</w:t>
       </w:r>
       <w:r>
         <w:rPr>
           <w:color w:val="008000"/>
         </w:rPr>
-        <w:t xml:space="preserve"> DONE - Investigation complete + double firing confirmed + fix applied 28 Oct 2026</w:t>
+        <w:t xml:space="preserve"> DONE - Investigation complete + double firing confirmed + fix applied 28 Oct 2026 12:27</w:t>
       </w:r>
     </w:p>
     <w:p/>
@@ -88,7 +98,7 @@
     </w:p>
     <w:p>
       <w:r>
-        <w:t>The tracking issue described in the task no longer exists. An additional critical problem was found and fixed: GA4 purchase double counting caused by two apps both firing to the same GA4 property.</w:t>
+        <w:t>The tracking issue described in the original task no longer exists. During investigation, an additional critical problem was found and fixed: GA4 was double counting every purchase due to two apps both firing purchase events to the same GA4 property.</w:t>
       </w:r>
     </w:p>
     <w:tbl>
@@ -161,7 +171,7 @@
           </w:tcPr>
           <w:p>
             <w:r>
-              <w:t>Not confirmed</w:t>
+              <w:t>NOT CONFIRMED - was wrong data</w:t>
             </w:r>
           </w:p>
         </w:tc>
@@ -183,7 +193,7 @@
           </w:tcPr>
           <w:p>
             <w:r>
-              <w:t>GA4 (31,128) &gt; Search Console (18,700)</w:t>
+              <w:t>GA4 (31,128) &gt; Search Console (18,700) - healthy</w:t>
             </w:r>
           </w:p>
         </w:tc>
@@ -193,7 +203,7 @@
           </w:tcPr>
           <w:p>
             <w:r>
-              <w:t>Not confirmed</w:t>
+              <w:t>NOT CONFIRMED - tracking working</w:t>
             </w:r>
           </w:p>
         </w:tc>
@@ -225,7 +235,7 @@
           </w:tcPr>
           <w:p>
             <w:r>
-              <w:t>Confirmed</w:t>
+              <w:t>CONFIRMED</w:t>
             </w:r>
           </w:p>
         </w:tc>
@@ -247,7 +257,7 @@
           </w:tcPr>
           <w:p>
             <w:r>
-              <w:t>Numeric transaction IDs confirmed</w:t>
+              <w:t>Numeric transaction IDs confirmed in GA4</w:t>
             </w:r>
           </w:p>
         </w:tc>
@@ -257,7 +267,7 @@
           </w:tcPr>
           <w:p>
             <w:r>
-              <w:t>Confirmed</w:t>
+              <w:t>CONFIRMED</w:t>
             </w:r>
           </w:p>
         </w:tc>
@@ -269,7 +279,7 @@
           </w:tcPr>
           <w:p>
             <w:r>
-              <w:t>NEW: GA4 purchase double counting</w:t>
+              <w:t>NEW FINDING: GA4 double counting</w:t>
             </w:r>
           </w:p>
         </w:tc>
@@ -279,7 +289,7 @@
           </w:tcPr>
           <w:p>
             <w:r>
-              <w:t>19,487 GA4 vs 11,009 Shopify (90 days)</w:t>
+              <w:t>GA4 19,487 vs Shopify 11,009 purchases (90 days)</w:t>
             </w:r>
           </w:p>
         </w:tc>
@@ -289,7 +299,7 @@
           </w:tcPr>
           <w:p>
             <w:r>
-              <w:t>Found and FIXED 28 Oct</w:t>
+              <w:t>FOUND AND FIXED 28 Oct</w:t>
             </w:r>
           </w:p>
         </w:tc>
@@ -301,7 +311,37 @@
         <w:pStyle w:val="Heading1"/>
       </w:pPr>
       <w:r>
-        <w:t>Full Investigation - Step by Step</w:t>
+        <w:t>Why the Original 2,043 Figure Was Wrong</w:t>
+      </w:r>
+    </w:p>
+    <w:p>
+      <w:r>
+        <w:t>Option A - Already fixed before task was assigned</w:t>
+        <w:br/>
+        <w:t>Infinite Google Ads (server-side tracking) was installed September 2025 to fix a Shopify tracking gap after Shopify updates in June 2025. The 2,043 figure was from before this fix.</w:t>
+        <w:br/>
+        <w:br/>
+        <w:t>Option B - Wrong GA4 property was checked</w:t>
+        <w:br/>
+        <w:t>- LEDSone neww (408110563) - connected to Shopify, active</w:t>
+        <w:br/>
+        <w:t>- Ledsone.co.uk - GA4 (268394549) - no data, not connected</w:t>
+        <w:br/>
+        <w:t>The 2,043 may have come from checking property 268394549.</w:t>
+        <w:br/>
+        <w:br/>
+        <w:t>Option C - Both A and B combined.</w:t>
+        <w:br/>
+        <w:br/>
+        <w:t>All three scenarios lead to the same conclusion: tracking is working correctly now.</w:t>
+      </w:r>
+    </w:p>
+    <w:p>
+      <w:pPr>
+        <w:pStyle w:val="Heading1"/>
+      </w:pPr>
+      <w:r>
+        <w:t>Full Investigation - Step by Step (26 Steps Total)</w:t>
       </w:r>
     </w:p>
     <w:p>
@@ -314,7 +354,10 @@
     </w:p>
     <w:p>
       <w:r>
-        <w:t>Checked Settings &gt; Customer Events. Found 5 Google-related pixels active simultaneously:</w:t>
+        <w:t>Checked Shopify Settings &gt; Customer Events.</w:t>
+        <w:br/>
+        <w:br/>
+        <w:t>Found 5 Google-related pixels active simultaneously:</w:t>
         <w:br/>
         <w:t>- Google &amp; YouTube (Server + Web)</w:t>
         <w:br/>
@@ -327,7 +370,7 @@
         <w:t>- Setup Tracking Pixel (Web only)</w:t>
         <w:br/>
         <w:br/>
-        <w:t>Risk flagged: Multiple Google pixels can cause session inflation and duplicate conversion counts.</w:t>
+        <w:t>Risk flagged: Multiple Google pixels active at the same time can cause session inflation and duplicate conversion counts.</w:t>
       </w:r>
     </w:p>
     <w:p>
@@ -375,7 +418,7 @@
           <w:i/>
           <w:sz w:val="18"/>
         </w:rPr>
-        <w:t>Shopify Customer Events - 5 Google pixels active simultaneously</w:t>
+        <w:t>Step 1 - Shopify Customer Events - 5 Google pixels active simultaneously</w:t>
       </w:r>
     </w:p>
     <w:p/>
@@ -389,7 +432,7 @@
     </w:p>
     <w:p>
       <w:r>
-        <w:t>Clicked into Google &amp; YouTube pixel. Data access granted June 2026. Connected to ledwebuk@gmail.com.</w:t>
+        <w:t>Clicked into Google &amp; YouTube pixel. Data access granted June 2026. Connected to ledwebuk@gmail.com. No Measurement ID visible at pixel level - opened the app to check.</w:t>
       </w:r>
     </w:p>
     <w:p>
@@ -437,7 +480,7 @@
           <w:i/>
           <w:sz w:val="18"/>
         </w:rPr>
-        <w:t>Google &amp; YouTube pixel - data access granted Jun 2026</w:t>
+        <w:t>Step 2 - Google &amp; YouTube pixel - data access granted Jun 2026</w:t>
       </w:r>
     </w:p>
     <w:p/>
@@ -446,20 +489,23 @@
         <w:pStyle w:val="Heading2"/>
       </w:pPr>
       <w:r>
-        <w:t>Step 3 - Measurement ID Confirmed</w:t>
+        <w:t>Step 3 - Measurement ID Confirmed in Google &amp; YouTube App</w:t>
       </w:r>
     </w:p>
     <w:p>
       <w:r>
-        <w:t>Opened the Google &amp; YouTube app. Connected services:</w:t>
+        <w:t>Opened the Google &amp; YouTube app. Confirmed connected services:</w:t>
         <w:br/>
-        <w:t>- Google Analytics: G-YXN7NVRK1K (LEDSone neww)</w:t>
+        <w:t>- Google Analytics: G-YXN7NVRK1K (LEDSone neww) - CORRECT</w:t>
         <w:br/>
         <w:t>- Google Ads: AW-904743911</w:t>
         <w:br/>
         <w:t>- Google Merchant Center: 5308512543</w:t>
         <w:br/>
         <w:t>- Account: ledwebuk@gmail.com</w:t>
+        <w:br/>
+        <w:br/>
+        <w:t>Measurement ID G-YXN7NVRK1K is correctly connected to the right GA4 property.</w:t>
       </w:r>
     </w:p>
     <w:p>
@@ -507,7 +553,7 @@
           <w:i/>
           <w:sz w:val="18"/>
         </w:rPr>
-        <w:t>Google &amp; YouTube app - Measurement ID G-YXN7NVRK1K confirmed</w:t>
+        <w:t>Step 3 - Google &amp; YouTube app - G-YXN7NVRK1K confirmed connected to LEDSone neww</w:t>
       </w:r>
     </w:p>
     <w:p/>
@@ -521,7 +567,7 @@
     </w:p>
     <w:p>
       <w:r>
-        <w:t>Opened GA4. Found multiple properties under Ledsone LTD WebSite account:</w:t>
+        <w:t>Opened GA4. Multiple properties found under Ledsone LTD WebSite account:</w:t>
       </w:r>
     </w:p>
     <w:tbl>
@@ -542,7 +588,7 @@
           </w:tcPr>
           <w:p>
             <w:r>
-              <w:t>Property</w:t>
+              <w:t>Property Name</w:t>
             </w:r>
           </w:p>
         </w:tc>
@@ -552,7 +598,7 @@
           </w:tcPr>
           <w:p>
             <w:r>
-              <w:t>ID</w:t>
+              <w:t>Property ID</w:t>
             </w:r>
           </w:p>
         </w:tc>
@@ -594,7 +640,7 @@
           </w:tcPr>
           <w:p>
             <w:r>
-              <w:t>Active - Shopify connected</w:t>
+              <w:t>Active - Shopify connected - CORRECT property</w:t>
             </w:r>
           </w:p>
         </w:tc>
@@ -626,7 +672,7 @@
           </w:tcPr>
           <w:p>
             <w:r>
-              <w:t>No data - not connected</w:t>
+              <w:t>No data received - NOT connected</w:t>
             </w:r>
           </w:p>
         </w:tc>
@@ -690,7 +736,7 @@
           </w:tcPr>
           <w:p>
             <w:r>
-              <w:t>Test property</w:t>
+              <w:t>Test property only</w:t>
             </w:r>
           </w:p>
         </w:tc>
@@ -722,7 +768,7 @@
           </w:tcPr>
           <w:p>
             <w:r>
-              <w:t>Separate site</w:t>
+              <w:t>Separate site - not ledsone.co.uk</w:t>
             </w:r>
           </w:p>
         </w:tc>
@@ -774,7 +820,7 @@
           <w:i/>
           <w:sz w:val="18"/>
         </w:rPr>
-        <w:t>GA4 - All properties under Ledsone LTD WebSite account</w:t>
+        <w:t>Step 4 - GA4 property list - multiple properties found</w:t>
       </w:r>
     </w:p>
     <w:p/>
@@ -783,12 +829,18 @@
         <w:pStyle w:val="Heading2"/>
       </w:pPr>
       <w:r>
-        <w:t>Step 5 - Wrong Property Identified</w:t>
+        <w:t>Step 5 - Wrong Property Identified (Source of 2,043 Figure)</w:t>
       </w:r>
     </w:p>
     <w:p>
       <w:r>
-        <w:t>Checked Ledsone.co.uk - GA4 (268394549). Result: 'No data received in past 48 hours' - not connected. This is the likely source of the original 2,043 organic session figure.</w:t>
+        <w:t>Checked Ledsone.co.uk - GA4 (268394549) - this property was named to look like the real one.</w:t>
+        <w:br/>
+        <w:br/>
+        <w:t>Result: 'No data received in past 48 hours'</w:t>
+        <w:br/>
+        <w:br/>
+        <w:t>This property is not connected to anything. This is almost certainly the source of the original 2,043 organic session figure in the task description. Whoever checked GA4 before assigning this task was looking at the wrong property.</w:t>
       </w:r>
     </w:p>
     <w:p>
@@ -836,7 +888,7 @@
           <w:i/>
           <w:sz w:val="18"/>
         </w:rPr>
-        <w:t>Wrong property (268394549) - no data received - explains the 2,043 figure</w:t>
+        <w:t>Step 5 - Wrong property 268394549 - no data received - explains the 2,043 figure</w:t>
       </w:r>
     </w:p>
     <w:p/>
@@ -850,15 +902,22 @@
     </w:p>
     <w:p>
       <w:r>
-        <w:t>Checked LEDSone neww (408110563):</w:t>
+        <w:t>Checked web stream details for LEDSone neww (408110563):</w:t>
+        <w:br/>
+        <w:t>- Stream Name: LEDSone neww</w:t>
         <w:br/>
         <w:t>- Stream URL: https://ledsone.co.uk/</w:t>
         <w:br/>
+        <w:t>- Stream ID: 6219544409</w:t>
+        <w:br/>
         <w:t>- Measurement ID: G-YXN7NVRK1K</w:t>
         <w:br/>
-        <w:t>- Status: Data collection active in past 48 hours</w:t>
+        <w:t>- Status: Data collection is active in past 48 hours</w:t>
         <w:br/>
-        <w:t>- Enhanced measurement: ON</w:t>
+        <w:t>- Enhanced measurement: ON (Page views, Scrolls, Outbound clicks + 4 more)</w:t>
+        <w:br/>
+        <w:br/>
+        <w:t>Shopify is connected to the correct property. Measurement ID is correct.</w:t>
       </w:r>
     </w:p>
     <w:p>
@@ -906,7 +965,7 @@
           <w:i/>
           <w:sz w:val="18"/>
         </w:rPr>
-        <w:t>LEDSone neww - web stream active, G-YXN7NVRK1K confirmed</w:t>
+        <w:t>Step 6 - LEDSone neww stream - active, correct URL, G-YXN7NVRK1K confirmed</w:t>
       </w:r>
     </w:p>
     <w:p/>
@@ -915,18 +974,24 @@
         <w:pStyle w:val="Heading2"/>
       </w:pPr>
       <w:r>
-        <w:t>Step 7 - Consent Settings</w:t>
+        <w:t>Step 7 - Consent Settings Check</w:t>
       </w:r>
     </w:p>
     <w:p>
       <w:r>
+        <w:t>Checked GA4 Admin &gt; Data collection &gt; Consent settings.</w:t>
+        <w:br/>
+        <w:br/>
         <w:t>Result: Excellent</w:t>
         <w:br/>
         <w:t>- Behavioural analytics consent signals: Active</w:t>
         <w:br/>
         <w:t>- Advertising consent signals: Active</w:t>
         <w:br/>
-        <w:t>- Consent mode is NOT the cause of any data gap.</w:t>
+        <w:t>- No issues detected</w:t>
+        <w:br/>
+        <w:br/>
+        <w:t>Consent mode is NOT the cause of any data gap.</w:t>
       </w:r>
     </w:p>
     <w:p>
@@ -974,7 +1039,7 @@
           <w:i/>
           <w:sz w:val="18"/>
         </w:rPr>
-        <w:t>Consent settings - Excellent, all signals active</w:t>
+        <w:t>Step 7 - Consent settings - Excellent, all signals active</w:t>
       </w:r>
     </w:p>
     <w:p/>
@@ -988,7 +1053,7 @@
     </w:p>
     <w:p>
       <w:r>
-        <w:t>Initial session campaign view showed fragmented organic data. Switched to Session default channel group.</w:t>
+        <w:t>Opened GA4 Reports &gt; Acquisition &gt; Traffic acquisition. Initial view showed Session campaign - organic data was fragmented across many campaigns making it hard to read. Switched to Session default channel group.</w:t>
       </w:r>
     </w:p>
     <w:p>
@@ -1036,7 +1101,7 @@
           <w:i/>
           <w:sz w:val="18"/>
         </w:rPr>
-        <w:t>Traffic acquisition - session campaign view (initial, fragmented)</w:t>
+        <w:t>Step 8 - Traffic acquisition - session campaign view (initial, fragmented)</w:t>
       </w:r>
     </w:p>
     <w:p/>
@@ -1050,7 +1115,7 @@
     </w:p>
     <w:p>
       <w:r>
-        <w:t>Last 90 days (29 Jul - 26 Oct 2026):</w:t>
+        <w:t>Switched to Session default channel group. Last 90 days (29 Jul - 26 Oct 2026):</w:t>
       </w:r>
     </w:p>
     <w:tbl>
@@ -1093,7 +1158,7 @@
           </w:tcPr>
           <w:p>
             <w:r>
-              <w:t>%</w:t>
+              <w:t>Percentage</w:t>
             </w:r>
           </w:p>
         </w:tc>
@@ -1113,7 +1178,7 @@
           </w:tcPr>
           <w:p>
             <w:r>
-              <w:t>Revenue</w:t>
+              <w:t>Revenue (GBP)</w:t>
             </w:r>
           </w:p>
         </w:tc>
@@ -1385,7 +1450,7 @@
           </w:tcPr>
           <w:p>
             <w:r>
-              <w:t>Total</w:t>
+              <w:t>TOTAL</w:t>
             </w:r>
           </w:p>
         </w:tc>
@@ -1434,7 +1499,7 @@
     <w:p/>
     <w:p>
       <w:r>
-        <w:t>84% Direct initially flagged as abnormal. Investigated further.</w:t>
+        <w:t>84% Direct traffic flagged as abnormal (normal benchmark: 20-30%). Investigated to find root cause.</w:t>
       </w:r>
     </w:p>
     <w:p>
@@ -1482,7 +1547,7 @@
           <w:i/>
           <w:sz w:val="18"/>
         </w:rPr>
-        <w:t>Traffic acquisition - default channel group - 84% Direct confirmed</w:t>
+        <w:t>Step 9 - Traffic acquisition - default channel group - 84% Direct found</w:t>
       </w:r>
     </w:p>
     <w:p/>
@@ -1496,9 +1561,17 @@
     </w:p>
     <w:p>
       <w:r>
-        <w:t>Tested http://ledsone.co.uk in incognito browser.</w:t>
+        <w:t>Tested http://ledsone.co.uk in incognito browser to check if redirect chain was stripping referrer headers and causing sessions to appear as Direct.</w:t>
         <w:br/>
-        <w:t>Result: Only 1 redirect - http to https. No www redirect. Clean chain - NOT causing referrer loss.</w:t>
+        <w:br/>
+        <w:t>Result: Only 1 redirect - http://ledsone.co.uk to https://ledsone.co.uk</w:t>
+        <w:br/>
+        <w:t>- No www redirect</w:t>
+        <w:br/>
+        <w:t>- Clean single hop</w:t>
+        <w:br/>
+        <w:br/>
+        <w:t>Redirect chain is NOT the cause of 84% Direct traffic.</w:t>
       </w:r>
     </w:p>
     <w:p>
@@ -1546,7 +1619,7 @@
           <w:i/>
           <w:sz w:val="18"/>
         </w:rPr>
-        <w:t>Redirect chain - http to https only, single hop, clean</w:t>
+        <w:t>Step 10 - Redirect chain test - single hop only, not causing referrer loss</w:t>
       </w:r>
     </w:p>
     <w:p/>
@@ -1560,7 +1633,7 @@
     </w:p>
     <w:p>
       <w:r>
-        <w:t>Opened GA4 DebugView. Debug Device showed 0 connected devices. Installed Tag Assistant to connect.</w:t>
+        <w:t>Opened GA4 Admin &gt; DebugView to check real-time session source recording. Debug Device showed 0 connected devices. Page view event visible but session source not readable without Tag Assistant. Proceeded to install Tag Assistant Chrome extension.</w:t>
       </w:r>
     </w:p>
     <w:p>
@@ -1608,7 +1681,7 @@
           <w:i/>
           <w:sz w:val="18"/>
         </w:rPr>
-        <w:t>GA4 DebugView - page_view event visible, debug device not yet connected</w:t>
+        <w:t>Step 11 - GA4 DebugView - page_view event visible, no device connected yet</w:t>
       </w:r>
     </w:p>
     <w:p/>
@@ -1622,15 +1695,21 @@
     </w:p>
     <w:p>
       <w:r>
-        <w:t>Tag Assistant found on ledsone.co.uk:</w:t>
+        <w:t>Installed Tag Assistant Chrome extension. Connected browser to ledsone.co.uk.</w:t>
         <w:br/>
-        <w:t>- GTM-KJGF2S5Q - Infinite Google Ads Container</w:t>
+        <w:br/>
+        <w:t>Tags found firing on ledsone.co.uk:</w:t>
+        <w:br/>
+        <w:t>- GTM-KJGF2S5Q - Infinite Google Ads GTM Container</w:t>
         <w:br/>
         <w:t>- G-YXN7NVRK1K</w:t>
         <w:br/>
         <w:t>- AW-904743911</w:t>
         <w:br/>
-        <w:t>- +3 more = 5 tags total firing</w:t>
+        <w:t>- 3 more tags = 5 tags total firing</w:t>
+        <w:br/>
+        <w:br/>
+        <w:t>Finding: Infinite Google Ads has its own GTM container injecting multiple tags separately from Shopify native pixels.</w:t>
       </w:r>
     </w:p>
     <w:p>
@@ -1678,7 +1757,7 @@
           <w:i/>
           <w:sz w:val="18"/>
         </w:rPr>
-        <w:t>Tag Assistant - GTM-KJGF2S5Q (Infinite Google Ads) found on ledsone.co.uk</w:t>
+        <w:t>Step 12 - Tag Assistant - GTM-KJGF2S5Q (Infinite Google Ads) found on ledsone.co.uk</w:t>
       </w:r>
     </w:p>
     <w:p/>
@@ -1727,7 +1806,7 @@
           <w:i/>
           <w:sz w:val="18"/>
         </w:rPr>
-        <w:t>Tag Assistant extension - 5 Google tags confirmed firing</w:t>
+        <w:t>Step 12b - Tag Assistant extension - 5 Google tags confirmed firing</w:t>
       </w:r>
     </w:p>
     <w:p/>
@@ -1736,12 +1815,28 @@
         <w:pStyle w:val="Heading2"/>
       </w:pPr>
       <w:r>
-        <w:t>Step 13 - Infinite Google Ads App</w:t>
+        <w:t>Step 13 - Infinite Google Ads App Investigation</w:t>
       </w:r>
     </w:p>
     <w:p>
       <w:r>
-        <w:t>Installed: September 19, 2025. Purpose: Accurate Google Ads Conversion Tracking &amp; GTM. Billing: $19.99/month.</w:t>
+        <w:t>Checked Shopify Admin &gt; Apps &gt; Infinite Google Ads.</w:t>
+        <w:br/>
+        <w:br/>
+        <w:t>- Installed: September 19, 2025</w:t>
+        <w:br/>
+        <w:t>- Purpose: Accurate Google Ads Conversion Tracking &amp; Google Tag Manager</w:t>
+        <w:br/>
+        <w:t>- Billing: $19.99/month</w:t>
+        <w:br/>
+        <w:t>- Pixels: Connected (Optimized)</w:t>
+        <w:br/>
+        <w:t>- Extensions: 1 active (Online Store)</w:t>
+        <w:br/>
+        <w:t>- Activity: No activity in last 30 days</w:t>
+        <w:br/>
+        <w:br/>
+        <w:t>Investigated why this app exists alongside Google &amp; YouTube app.</w:t>
       </w:r>
     </w:p>
     <w:p>
@@ -1789,7 +1884,7 @@
           <w:i/>
           <w:sz w:val="18"/>
         </w:rPr>
-        <w:t>Infinite Google Ads app - $19.99/month, installed Sep 2025</w:t>
+        <w:t>Step 13 - Infinite Google Ads app - $19.99/month, installed Sep 2025</w:t>
       </w:r>
     </w:p>
     <w:p/>
@@ -1803,9 +1898,19 @@
     </w:p>
     <w:p>
       <w:r>
-        <w:t>Connected to: LEDSone / AW-904743911 - same Google Ads account as Google &amp; YouTube app.</w:t>
+        <w:t>Opened the Infinite Google Ads app settings to check connected accounts.</w:t>
         <w:br/>
-        <w:t>Team confirmed: intentional server-side tracking, not a duplicate.</w:t>
+        <w:br/>
+        <w:t>- Ads Account: LEDSone / 4503486236</w:t>
+        <w:br/>
+        <w:t>- GTM Account: ledsone uk ltd</w:t>
+        <w:br/>
+        <w:t>- GTM Container: GTM-KJGF2S5Q</w:t>
+        <w:br/>
+        <w:t>- Google Pixel ID: AW-904743911</w:t>
+        <w:br/>
+        <w:br/>
+        <w:t>Same Google Ads account (AW-904743911) as the Google &amp; YouTube app. Initially appeared as a duplicate setup - team was consulted to confirm.</w:t>
       </w:r>
     </w:p>
     <w:p>
@@ -1853,7 +1958,7 @@
           <w:i/>
           <w:sz w:val="18"/>
         </w:rPr>
-        <w:t>Infinite Google Ads - connected to LEDSone / AW-904743911</w:t>
+        <w:t>Step 14 - Infinite Google Ads - connected to LEDSone AW-904743911</w:t>
       </w:r>
     </w:p>
     <w:p/>
@@ -1862,21 +1967,30 @@
         <w:pStyle w:val="Heading2"/>
       </w:pPr>
       <w:r>
-        <w:t>Step 15 - Team Confirmation</w:t>
+        <w:t>Step 15 - Team Confirmation (Why Infinite Google Ads Was Installed)</w:t>
       </w:r>
     </w:p>
     <w:p>
       <w:r>
-        <w:t>Jefri: After Shopify updates Jun 2025, conversion data stopped showing. Installed Infinite Google Ads to fix tracking.</w:t>
+        <w:t>Asked the team why this app exists alongside Google &amp; YouTube.</w:t>
         <w:br/>
         <w:br/>
-        <w:t>Sonya: Infinite series apps provide server-side conversion tracking. Browser pixels miss 20-30% of transactions due to iOS/ad-blockers.</w:t>
+        <w:t>Jefri (Google Ads manager):</w:t>
+        <w:br/>
+        <w:t>"After the Shopify updates around June 2025, conversion data stopped showing up properly on Google Ads and Shopify. Our old gtag setup was not working like it used to, so we installed the Infinite Google Ads app to fix the tracking."</w:t>
         <w:br/>
         <w:br/>
-        <w:t>Sajeepan: Supporting multiple conversion tracking setups across 3 GMC configs. App improves reliability.</w:t>
+        <w:t>Sonya (Digital):</w:t>
+        <w:br/>
+        <w:t>"The Infinite series of apps provide server-side conversion tracking and first-party data collection. Due to iOS privacy restrictions and browser ad-blockers, standard browser-based pixels often miss 20% to 30% of actual e-commerce transactions. By shifting the tracking from the browser to the server side, this setup ensures data accuracy across the entire marketing ecosystem."</w:t>
         <w:br/>
         <w:br/>
-        <w:t>Conclusion: App is intentional and critical. Must NOT be removed.</w:t>
+        <w:t>Sajeepan:</w:t>
+        <w:br/>
+        <w:t>"We are using the Infinite Google Ads app to support multiple conversion tracking setups across our 3 GMC configurations. Some conversions were not being recorded correctly, potentially due to tracking changes and browser cookie restrictions. The app is intended to improve tracking reliability and conversion reporting."</w:t>
+        <w:br/>
+        <w:br/>
+        <w:t>Conclusion: App is intentional, critical, and must NOT be removed.</w:t>
       </w:r>
     </w:p>
     <w:p>
@@ -1924,7 +2038,7 @@
           <w:i/>
           <w:sz w:val="18"/>
         </w:rPr>
-        <w:t>Team confirmation - server-side tracking intentional, critical</w:t>
+        <w:t>Step 15 - Team confirmation - server-side tracking intentional, installed after Jun 2025 Shopify break</w:t>
       </w:r>
     </w:p>
     <w:p/>
@@ -1933,12 +2047,29 @@
         <w:pStyle w:val="Heading2"/>
       </w:pPr>
       <w:r>
-        <w:t>Step 16 - 84% Direct Verified as Server-Side (7-Day Check)</w:t>
+        <w:t>Step 16 - 84% Direct Verified as Server-Side Behaviour (7-Day Check)</w:t>
       </w:r>
     </w:p>
     <w:p>
       <w:r>
-        <w:t>Last 7 days: Direct 50,894 (65.58%), Cross-network 15,685 (20.21%), Organic Social 3,621 (4.67%), Organic Search 2,629 (3.39%). Flat dominant Direct line every day = server-side pattern confirmed, not a spike.</w:t>
+        <w:t>Checked if Direct traffic was consistently high across all 7 days (to confirm it is not a spike).</w:t>
+        <w:br/>
+        <w:br/>
+        <w:t>Last 7 days:</w:t>
+        <w:br/>
+        <w:t>- Direct: 50,894 sessions (65.58%)</w:t>
+        <w:br/>
+        <w:t>- Cross-network: 15,685 (20.21%)</w:t>
+        <w:br/>
+        <w:t>- Organic Social: 3,621 (4.67%)</w:t>
+        <w:br/>
+        <w:t>- Organic Search: 2,629 (3.39%)</w:t>
+        <w:br/>
+        <w:br/>
+        <w:t>Direct is consistently 65%+ every single day - flat dominant line across the whole week. This confirms server-side tracking behaviour, not a random issue or spike.</w:t>
+        <w:br/>
+        <w:br/>
+        <w:t>Also noted: Direct has 65% of sessions but only 14% of purchases - server-side sessions are mostly non-converting visits. Real converting traffic is correctly attributed under Cross-network and Organic channels.</w:t>
       </w:r>
     </w:p>
     <w:p>
@@ -1986,7 +2117,7 @@
           <w:i/>
           <w:sz w:val="18"/>
         </w:rPr>
-        <w:t>GA4 last 7 days - Direct consistently 65% every day</w:t>
+        <w:t>Step 16 - GA4 last 7 days - Direct consistently 65% every day confirming server-side pattern</w:t>
       </w:r>
     </w:p>
     <w:p/>
@@ -1996,6 +2127,11 @@
       </w:pPr>
       <w:r>
         <w:t>Step 17 - Google Ads vs GA4 Conversion Comparison</w:t>
+      </w:r>
+    </w:p>
+    <w:p>
+      <w:r>
+        <w:t>Cross-checked Google Ads conversions (last 30 days) against GA4 to verify server-side tracking is adding real value:</w:t>
       </w:r>
     </w:p>
     <w:tbl>
@@ -2037,7 +2173,7 @@
           </w:tcPr>
           <w:p>
             <w:r>
-              <w:t>Count</w:t>
+              <w:t>Count (30 days)</w:t>
             </w:r>
           </w:p>
         </w:tc>
@@ -2047,7 +2183,7 @@
           </w:tcPr>
           <w:p>
             <w:r>
-              <w:t>Value</w:t>
+              <w:t>Value (GBP)</w:t>
             </w:r>
           </w:p>
         </w:tc>
@@ -2069,7 +2205,7 @@
           </w:tcPr>
           <w:p>
             <w:r>
-              <w:t>GA4 browser</w:t>
+              <w:t>GA4 browser-side</w:t>
             </w:r>
           </w:p>
         </w:tc>
@@ -2111,7 +2247,7 @@
           </w:tcPr>
           <w:p>
             <w:r>
-              <w:t>Server-side</w:t>
+              <w:t>Infinite Google Ads server-side</w:t>
             </w:r>
           </w:p>
         </w:tc>
@@ -2153,7 +2289,7 @@
           </w:tcPr>
           <w:p>
             <w:r>
-              <w:t>Website</w:t>
+              <w:t>Website / browser</w:t>
             </w:r>
           </w:p>
         </w:tc>
@@ -2224,7 +2360,11 @@
     <w:p/>
     <w:p>
       <w:r>
-        <w:t>Server-side captures 2,842 additional purchases (98k) missed by browser GA4. Working as intended and critical.</w:t>
+        <w:t>Server-side captures 2,842 additional purchases worth 98,782 GBP that browser GA4 missed.</w:t>
+        <w:br/>
+        <w:t>Without Infinite Google Ads, 98k in conversions would be invisible to Google Ads.</w:t>
+        <w:br/>
+        <w:t>This confirms the app is working as intended and is critical to keep.</w:t>
       </w:r>
     </w:p>
     <w:p>
@@ -2272,7 +2412,7 @@
           <w:i/>
           <w:sz w:val="18"/>
         </w:rPr>
-        <w:t>Google Ads conversions - server-side adds 2,842 purchases (98k)</w:t>
+        <w:t>Step 17 - Google Ads conversions - server-side InfinitePi adds 2,842 purchases (98k GBP)</w:t>
       </w:r>
     </w:p>
     <w:p/>
@@ -2286,7 +2426,21 @@
     </w:p>
     <w:p>
       <w:r>
-        <w:t>Last 7 days: Items viewed 42,447 | Added to cart 6,806 | Items purchased 5,680 | Revenue 66,468.57</w:t>
+        <w:t>Checked GA4 Monetisation &gt; E-commerce purchases to verify purchase events are firing at product level.</w:t>
+        <w:br/>
+        <w:br/>
+        <w:t>Last 7 days:</w:t>
+        <w:br/>
+        <w:t>- Total items viewed: 42,447</w:t>
+        <w:br/>
+        <w:t>- Items added to cart: 6,806</w:t>
+        <w:br/>
+        <w:t>- Items purchased: 5,680</w:t>
+        <w:br/>
+        <w:t>- Revenue: 66,468.57 GBP</w:t>
+        <w:br/>
+        <w:br/>
+        <w:t>Purchase events are firing correctly at product level.</w:t>
       </w:r>
     </w:p>
     <w:p>
@@ -2334,7 +2488,7 @@
           <w:i/>
           <w:sz w:val="18"/>
         </w:rPr>
-        <w:t>GA4 E-commerce purchases - 5,680 items purchased, 66,468 revenue</w:t>
+        <w:t>Step 18 - GA4 E-commerce purchases by item - 5,680 purchased, 66,468 GBP revenue</w:t>
       </w:r>
     </w:p>
     <w:p/>
@@ -2343,7 +2497,12 @@
         <w:pStyle w:val="Heading2"/>
       </w:pPr>
       <w:r>
-        <w:t>Step 19 - Transaction IDs Verified</w:t>
+        <w:t>Step 19 - Transaction IDs Checked (Shopify Order Numbers)</w:t>
+      </w:r>
+    </w:p>
+    <w:p>
+      <w:r>
+        <w:t>Checked GA4 Monetisation &gt; Transactions. Last 7 days: 1,765 purchases, 66,938 GBP.</w:t>
       </w:r>
     </w:p>
     <w:tbl>
@@ -2365,7 +2524,7 @@
           </w:tcPr>
           <w:p>
             <w:r>
-              <w:t>Type</w:t>
+              <w:t>ID Type</w:t>
             </w:r>
           </w:p>
         </w:tc>
@@ -2427,7 +2586,7 @@
           </w:tcPr>
           <w:p>
             <w:r>
-              <w:t>Shopify order number</w:t>
+              <w:t>Real Shopify order number</w:t>
             </w:r>
           </w:p>
         </w:tc>
@@ -2437,7 +2596,7 @@
           </w:tcPr>
           <w:p>
             <w:r>
-              <w:t>Correct</w:t>
+              <w:t>Correct - from Google &amp; YouTube</w:t>
             </w:r>
           </w:p>
         </w:tc>
@@ -2459,7 +2618,7 @@
           </w:tcPr>
           <w:p>
             <w:r>
-              <w:t>54cd4d4a-2e18-4675...</w:t>
+              <w:t>54cd4d4a-2e18-4675-9c24-aaf9522266a7</w:t>
             </w:r>
           </w:p>
         </w:tc>
@@ -2469,7 +2628,7 @@
           </w:tcPr>
           <w:p>
             <w:r>
-              <w:t>Infinite Google Ads random ID</w:t>
+              <w:t>Random ID generated by Infinite Google Ads</w:t>
             </w:r>
           </w:p>
         </w:tc>
@@ -2479,7 +2638,7 @@
           </w:tcPr>
           <w:p>
             <w:r>
-              <w:t>Duplicate - see Step 21</w:t>
+              <w:t>Duplicate - investigated in Steps 21-25</w:t>
             </w:r>
           </w:p>
         </w:tc>
@@ -2521,13 +2680,18 @@
           </w:tcPr>
           <w:p>
             <w:r>
-              <w:t>8 purchases, minor</w:t>
+              <w:t>8 purchases, low priority</w:t>
             </w:r>
           </w:p>
         </w:tc>
       </w:tr>
     </w:tbl>
     <w:p/>
+    <w:p>
+      <w:r>
+        <w:t>Shopify order numbers are passing correctly for browser-tracked purchases. UUID format is from Infinite Google Ads server-side. Further investigation below confirmed these UUIDs are causing double counting.</w:t>
+      </w:r>
+    </w:p>
     <w:p>
       <w:r>
         <w:drawing>
@@ -2573,7 +2737,7 @@
           <w:i/>
           <w:sz w:val="18"/>
         </w:rPr>
-        <w:t>GA4 Transactions - numeric Shopify IDs + UUID server-side IDs</w:t>
+        <w:t>Step 19 - GA4 Transactions - numeric Shopify order IDs and UUID server-side IDs visible</w:t>
       </w:r>
     </w:p>
     <w:p/>
@@ -2582,7 +2746,7 @@
         <w:pStyle w:val="Heading2"/>
       </w:pPr>
       <w:r>
-        <w:t>Step 20 - Cross-Platform Verification (90 Days)</w:t>
+        <w:t>Step 20 - Final Cross-Platform Verification (90 Days)</w:t>
       </w:r>
     </w:p>
     <w:tbl>
@@ -2623,7 +2787,7 @@
           </w:tcPr>
           <w:p>
             <w:r>
-              <w:t>Value</w:t>
+              <w:t>90-Day Value</w:t>
             </w:r>
           </w:p>
         </w:tc>
@@ -2709,7 +2873,7 @@
           </w:tcPr>
           <w:p>
             <w:r>
-              <w:t>GA4 &gt; GSC by 12,428</w:t>
+              <w:t>GA4 &gt; GSC by 12,428 sessions</w:t>
             </w:r>
           </w:p>
         </w:tc>
@@ -2719,7 +2883,7 @@
           </w:tcPr>
           <w:p>
             <w:r>
-              <w:t>Normal - GA4 counts all search engines</w:t>
+              <w:t>Normal - explained below</w:t>
             </w:r>
           </w:p>
         </w:tc>
@@ -2771,7 +2935,7 @@
           <w:i/>
           <w:sz w:val="18"/>
         </w:rPr>
-        <w:t>GA4 - last 90 days - Organic Search 31,128 sessions</w:t>
+        <w:t>Step 20a - GA4 last 90 days - Organic Search 31,128 sessions</w:t>
       </w:r>
     </w:p>
     <w:p/>
@@ -2820,13 +2984,43 @@
           <w:i/>
           <w:sz w:val="18"/>
         </w:rPr>
-        <w:t>Search Console - last 90 days - 18,700 total clicks</w:t>
+        <w:t>Step 20b - Search Console last 90 days - 18,700 total clicks</w:t>
       </w:r>
     </w:p>
     <w:p/>
     <w:p>
+      <w:pPr>
+        <w:pStyle w:val="Heading2"/>
+      </w:pPr>
       <w:r>
-        <w:t>GA4 &gt; Search Console is completely normal. GA4 counts Google + Bing + Yahoo + DuckDuckGo. Search Console counts Google only. The 12,428 difference = non-Google organic traffic.</w:t>
+        <w:t>Why GA4 &gt; Search Console Is Normal</w:t>
+      </w:r>
+    </w:p>
+    <w:p>
+      <w:r>
+        <w:t>Search Console counts clicks from Google Search only.</w:t>
+        <w:br/>
+        <w:t>It does NOT count visitors from Bing, Yahoo, DuckDuckGo, or any other search engine.</w:t>
+        <w:br/>
+        <w:br/>
+        <w:t>GA4 Organic Search counts ALL search engines: Google + Bing + Yahoo + DuckDuckGo + all others.</w:t>
+        <w:br/>
+        <w:br/>
+        <w:t>Comparison:</w:t>
+        <w:br/>
+        <w:t>- Search Console: 18,700 = Google clicks only</w:t>
+        <w:br/>
+        <w:t>- GA4 Organic: 31,128 = Google + all other search engines</w:t>
+        <w:br/>
+        <w:t>- Difference of 12,428 = non-Google organic traffic (Bing, Yahoo, etc)</w:t>
+        <w:br/>
+        <w:br/>
+        <w:t>GA4 showing MORE than Search Console = tracking working correctly.</w:t>
+        <w:br/>
+        <w:t>GA4 showing LESS than Search Console = tracking broken.</w:t>
+        <w:br/>
+        <w:br/>
+        <w:t>The original task claimed GA4 showed only 2,043 sessions - that figure was from the wrong property (268394549).</w:t>
       </w:r>
     </w:p>
     <w:p>
@@ -2834,25 +3028,33 @@
         <w:pStyle w:val="Heading1"/>
       </w:pPr>
       <w:r>
-        <w:t>Step 21 - GA4 Purchase Double Counting (Critical Finding)</w:t>
+        <w:t>Step 21 - GA4 Purchase Double Counting Discovered (Critical)</w:t>
       </w:r>
     </w:p>
     <w:p>
       <w:r>
-        <w:t>During transaction ID investigation, revenue totals did not match Shopify:</w:t>
-        <w:br/>
-        <w:t>- GA4 purchases (90 days): 19,487</w:t>
-        <w:br/>
-        <w:t>- Shopify orders (90 days): 11,009</w:t>
-        <w:br/>
-        <w:t>- Ratio: 1.77x (GA4 almost double Shopify)</w:t>
+        <w:t>While verifying transaction IDs, revenue totals did not match Shopify:</w:t>
         <w:br/>
         <w:br/>
-        <w:t>- GA4 revenue (7 days): 66,938.30</w:t>
+        <w:t>90-day comparison:</w:t>
         <w:br/>
-        <w:t>- Shopify revenue (7 days): 38,288.74</w:t>
+        <w:t>- GA4 purchases: 19,487</w:t>
         <w:br/>
-        <w:t>- Ratio: 1.75x</w:t>
+        <w:t>- Shopify orders: 11,009</w:t>
+        <w:br/>
+        <w:t>- Ratio: 1.77x (GA4 almost double)</w:t>
+        <w:br/>
+        <w:br/>
+        <w:t>7-day revenue comparison:</w:t>
+        <w:br/>
+        <w:t>- GA4 total revenue: 66,938.30 GBP</w:t>
+        <w:br/>
+        <w:t>- Shopify revenue: 38,288.74 GBP</w:t>
+        <w:br/>
+        <w:t>- Ratio: 1.75x overcounting</w:t>
+        <w:br/>
+        <w:br/>
+        <w:t>This indicated every order was being counted approximately twice in GA4.</w:t>
       </w:r>
     </w:p>
     <w:p>
@@ -2860,12 +3062,23 @@
         <w:pStyle w:val="Heading2"/>
       </w:pPr>
       <w:r>
-        <w:t>Evidence - Same Order Counted Twice in GA4 Explore</w:t>
+        <w:t>Step 22 - GA4 Explore: Matching Revenue Pairs Found</w:t>
       </w:r>
     </w:p>
     <w:p>
       <w:r>
-        <w:t>Created GA4 Explore: Transaction ID + Purchase Revenue, sorted descending, date 20-26 Oct 2026.</w:t>
+        <w:t>Created GA4 Explore with:</w:t>
+        <w:br/>
+        <w:t>- Dimension: Transaction ID</w:t>
+        <w:br/>
+        <w:t>- Metric: Purchase revenue (E-commerce)</w:t>
+        <w:br/>
+        <w:t>- Date: 20-26 Oct 2026</w:t>
+        <w:br/>
+        <w:t>- Sort: Revenue descending</w:t>
+        <w:br/>
+        <w:br/>
+        <w:t>Result: Same revenue amounts appearing under two different IDs - one numeric, one UUID.</w:t>
       </w:r>
     </w:p>
     <w:tbl>
@@ -2917,7 +3130,7 @@
           </w:tcPr>
           <w:p>
             <w:r>
-              <w:t>Same Order?</w:t>
+              <w:t>Verdict</w:t>
             </w:r>
           </w:p>
         </w:tc>
@@ -2949,7 +3162,7 @@
           </w:tcPr>
           <w:p>
             <w:r>
-              <w:t>635.46 each</w:t>
+              <w:t>635.46 GBP each</w:t>
             </w:r>
           </w:p>
         </w:tc>
@@ -2959,7 +3172,7 @@
           </w:tcPr>
           <w:p>
             <w:r>
-              <w:t>YES - double counted</w:t>
+              <w:t>SAME ORDER - double counted</w:t>
             </w:r>
           </w:p>
         </w:tc>
@@ -2991,7 +3204,7 @@
           </w:tcPr>
           <w:p>
             <w:r>
-              <w:t>356.25 each</w:t>
+              <w:t>356.25 GBP each</w:t>
             </w:r>
           </w:p>
         </w:tc>
@@ -3001,7 +3214,7 @@
           </w:tcPr>
           <w:p>
             <w:r>
-              <w:t>YES - double counted</w:t>
+              <w:t>SAME ORDER - double counted</w:t>
             </w:r>
           </w:p>
         </w:tc>
@@ -3033,7 +3246,7 @@
           </w:tcPr>
           <w:p>
             <w:r>
-              <w:t>349.65 each</w:t>
+              <w:t>349.65 GBP each</w:t>
             </w:r>
           </w:p>
         </w:tc>
@@ -3043,7 +3256,7 @@
           </w:tcPr>
           <w:p>
             <w:r>
-              <w:t>YES - double counted</w:t>
+              <w:t>SAME ORDER - double counted</w:t>
             </w:r>
           </w:p>
         </w:tc>
@@ -3055,30 +3268,156 @@
         <w:pStyle w:val="Heading2"/>
       </w:pPr>
       <w:r>
-        <w:t>Evidence - Shopify Order Search Confirms Source</w:t>
+        <w:t>Step 23 - Shopify Order Search: Numeric ID Verified</w:t>
       </w:r>
     </w:p>
     <w:p>
       <w:r>
-        <w:t>Numeric ID search in Shopify:</w:t>
-        <w:br/>
-        <w:t>Search: 13738544857474 -&gt; Order #LED70041, Danielle Lloyd, 635.46, Paid, Fulfilled - FOUND</w:t>
+        <w:t>Searched Shopify Orders for numeric transaction ID: 13738544857474</w:t>
         <w:br/>
         <w:br/>
-        <w:t>UUID search in Shopify:</w:t>
+        <w:t>Result: Order #LED70041 found</w:t>
         <w:br/>
-        <w:t>Search: 54cd4d4a-2e18-4675-9c24-aaf9522266a7 -&gt; No orders found</w:t>
+        <w:t>- Customer: Danielle Lloyd</w:t>
+        <w:br/>
+        <w:t>- Total: 635.46 GBP</w:t>
+        <w:br/>
+        <w:t>- Status: Paid, Fulfilled</w:t>
+        <w:br/>
+        <w:t>- Channel: Online Store</w:t>
         <w:br/>
         <w:br/>
-        <w:t>Conclusion: Numeric IDs are real Shopify orders sent by Google &amp; YouTube. UUIDs are randomly generated by Infinite Google Ads - same order, different fake ID, GA4 cannot deduplicate.</w:t>
+        <w:t>CONFIRMED: Numeric IDs are real Shopify order numbers sent by Google &amp; YouTube app.</w:t>
       </w:r>
     </w:p>
+    <w:p>
+      <w:r>
+        <w:drawing>
+          <wp:inline xmlns:a="http://schemas.openxmlformats.org/drawingml/2006/main" xmlns:pic="http://schemas.openxmlformats.org/drawingml/2006/picture">
+            <wp:extent cx="5486400" cy="1456031"/>
+            <wp:docPr id="23" name="Picture 23"/>
+            <wp:cNvGraphicFramePr>
+              <a:graphicFrameLocks noChangeAspect="1"/>
+            </wp:cNvGraphicFramePr>
+            <a:graphic>
+              <a:graphicData uri="http://schemas.openxmlformats.org/drawingml/2006/picture">
+                <pic:pic>
+                  <pic:nvPicPr>
+                    <pic:cNvPr id="0" name="23-shopify-order-numeric-found.png"/>
+                    <pic:cNvPicPr/>
+                  </pic:nvPicPr>
+                  <pic:blipFill>
+                    <a:blip r:embed="rId31"/>
+                    <a:stretch>
+                      <a:fillRect/>
+                    </a:stretch>
+                  </pic:blipFill>
+                  <pic:spPr>
+                    <a:xfrm>
+                      <a:off x="0" y="0"/>
+                      <a:ext cx="5486400" cy="1456031"/>
+                    </a:xfrm>
+                    <a:prstGeom prst="rect"/>
+                  </pic:spPr>
+                </pic:pic>
+              </a:graphicData>
+            </a:graphic>
+          </wp:inline>
+        </w:drawing>
+      </w:r>
+    </w:p>
+    <w:p>
+      <w:pPr>
+        <w:jc w:val="center"/>
+      </w:pPr>
+      <w:r>
+        <w:rPr>
+          <w:i/>
+          <w:sz w:val="18"/>
+        </w:rPr>
+        <w:t>Step 23 - Shopify order search - 13738544857474 found as Order #LED70041, 635.46 GBP</w:t>
+      </w:r>
+    </w:p>
+    <w:p/>
     <w:p>
       <w:pPr>
         <w:pStyle w:val="Heading2"/>
       </w:pPr>
       <w:r>
-        <w:t>Root Cause</w:t>
+        <w:t>Step 24 - Shopify Order Search: UUID Returns Nothing</w:t>
+      </w:r>
+    </w:p>
+    <w:p>
+      <w:r>
+        <w:t>Searched Shopify Orders for UUID: 54cd4d4a-2e18-4675-9c24-aaf9522266a7</w:t>
+        <w:br/>
+        <w:br/>
+        <w:t>Result: No orders found</w:t>
+        <w:br/>
+        <w:br/>
+        <w:t>CONFIRMED: UUID is a randomly generated ID by Infinite Google Ads. It does not exist in Shopify. It refers to the same order as #LED70041 but with a fake ID that GA4 cannot match to the numeric ID - so GA4 counts it as a completely separate purchase.</w:t>
+      </w:r>
+    </w:p>
+    <w:p>
+      <w:r>
+        <w:drawing>
+          <wp:inline xmlns:a="http://schemas.openxmlformats.org/drawingml/2006/main" xmlns:pic="http://schemas.openxmlformats.org/drawingml/2006/picture">
+            <wp:extent cx="5486400" cy="2070705"/>
+            <wp:docPr id="24" name="Picture 24"/>
+            <wp:cNvGraphicFramePr>
+              <a:graphicFrameLocks noChangeAspect="1"/>
+            </wp:cNvGraphicFramePr>
+            <a:graphic>
+              <a:graphicData uri="http://schemas.openxmlformats.org/drawingml/2006/picture">
+                <pic:pic>
+                  <pic:nvPicPr>
+                    <pic:cNvPr id="0" name="24-shopify-uuid-not-found.png"/>
+                    <pic:cNvPicPr/>
+                  </pic:nvPicPr>
+                  <pic:blipFill>
+                    <a:blip r:embed="rId32"/>
+                    <a:stretch>
+                      <a:fillRect/>
+                    </a:stretch>
+                  </pic:blipFill>
+                  <pic:spPr>
+                    <a:xfrm>
+                      <a:off x="0" y="0"/>
+                      <a:ext cx="5486400" cy="2070705"/>
+                    </a:xfrm>
+                    <a:prstGeom prst="rect"/>
+                  </pic:spPr>
+                </pic:pic>
+              </a:graphicData>
+            </a:graphic>
+          </wp:inline>
+        </w:drawing>
+      </w:r>
+    </w:p>
+    <w:p>
+      <w:pPr>
+        <w:jc w:val="center"/>
+      </w:pPr>
+      <w:r>
+        <w:rPr>
+          <w:i/>
+          <w:sz w:val="18"/>
+        </w:rPr>
+        <w:t>Step 24 - Shopify order search - UUID 54cd4d4a returns no orders - fake ID confirmed</w:t>
+      </w:r>
+    </w:p>
+    <w:p/>
+    <w:p>
+      <w:pPr>
+        <w:pStyle w:val="Heading2"/>
+      </w:pPr>
+      <w:r>
+        <w:t>Step 25 - Root Cause: Both Apps Had GA4 Measurement ID Entered</w:t>
+      </w:r>
+    </w:p>
+    <w:p>
+      <w:r>
+        <w:t>Checked settings of both apps to find exactly where the duplicate GA4 event originated:</w:t>
       </w:r>
     </w:p>
     <w:tbl>
@@ -3130,7 +3469,7 @@
           </w:tcPr>
           <w:p>
             <w:r>
-              <w:t>Result</w:t>
+              <w:t>Action Required</w:t>
             </w:r>
           </w:p>
         </w:tc>
@@ -3142,7 +3481,7 @@
           </w:tcPr>
           <w:p>
             <w:r>
-              <w:t>Google &amp; YouTube (browser)</w:t>
+              <w:t>Google &amp; YouTube (browser-side)</w:t>
             </w:r>
           </w:p>
         </w:tc>
@@ -3152,7 +3491,7 @@
           </w:tcPr>
           <w:p>
             <w:r>
-              <w:t>G-YXN7NVRK1K</w:t>
+              <w:t>G-YXN7NVRK1K - entered via official Shopify integration</w:t>
             </w:r>
           </w:p>
         </w:tc>
@@ -3162,7 +3501,7 @@
           </w:tcPr>
           <w:p>
             <w:r>
-              <w:t>Shopify numeric (13738544857474)</w:t>
+              <w:t>Shopify numeric order number</w:t>
             </w:r>
           </w:p>
         </w:tc>
@@ -3172,7 +3511,7 @@
           </w:tcPr>
           <w:p>
             <w:r>
-              <w:t>Correct - keep</w:t>
+              <w:t>Keep - correct official connection</w:t>
             </w:r>
           </w:p>
         </w:tc>
@@ -3184,7 +3523,7 @@
           </w:tcPr>
           <w:p>
             <w:r>
-              <w:t>Infinite Google Ads (server)</w:t>
+              <w:t>Infinite Google Ads (server-side)</w:t>
             </w:r>
           </w:p>
         </w:tc>
@@ -3194,7 +3533,7 @@
           </w:tcPr>
           <w:p>
             <w:r>
-              <w:t>G-YXN7NVRK1K</w:t>
+              <w:t>G-YXN7NVRK1K - manually entered in Setup GA4 field</w:t>
             </w:r>
           </w:p>
         </w:tc>
@@ -3204,7 +3543,7 @@
           </w:tcPr>
           <w:p>
             <w:r>
-              <w:t>Random UUID (54cd4d4a-...)</w:t>
+              <w:t>Random UUID</w:t>
             </w:r>
           </w:p>
         </w:tc>
@@ -3214,7 +3553,7 @@
           </w:tcPr>
           <w:p>
             <w:r>
-              <w:t>Duplicate - removed</w:t>
+              <w:t>Remove - causing double counting</w:t>
             </w:r>
           </w:p>
         </w:tc>
@@ -3223,40 +3562,178 @@
     <w:p/>
     <w:p>
       <w:r>
-        <w:t>Both apps had G-YXN7NVRK1K entered. Infinite Google Ads Settings &gt; Setup GA4 field had the measurement ID entered manually, causing every order to be counted twice in GA4.</w:t>
+        <w:t>The Infinite Google Ads app had G-YXN7NVRK1K manually entered in its Setup GA4 section. This caused it to send a GA4 purchase event for every order - in addition to Google &amp; YouTube already doing the same. Because the transaction IDs are different (numeric vs UUID), GA4 cannot deduplicate them and counts both as separate purchases.</w:t>
       </w:r>
     </w:p>
+    <w:p>
+      <w:r>
+        <w:drawing>
+          <wp:inline xmlns:a="http://schemas.openxmlformats.org/drawingml/2006/main" xmlns:pic="http://schemas.openxmlformats.org/drawingml/2006/picture">
+            <wp:extent cx="5486400" cy="5880295"/>
+            <wp:docPr id="25" name="Picture 25"/>
+            <wp:cNvGraphicFramePr>
+              <a:graphicFrameLocks noChangeAspect="1"/>
+            </wp:cNvGraphicFramePr>
+            <a:graphic>
+              <a:graphicData uri="http://schemas.openxmlformats.org/drawingml/2006/picture">
+                <pic:pic>
+                  <pic:nvPicPr>
+                    <pic:cNvPr id="0" name="25-google-youtube-conversion-settings.png"/>
+                    <pic:cNvPicPr/>
+                  </pic:nvPicPr>
+                  <pic:blipFill>
+                    <a:blip r:embed="rId33"/>
+                    <a:stretch>
+                      <a:fillRect/>
+                    </a:stretch>
+                  </pic:blipFill>
+                  <pic:spPr>
+                    <a:xfrm>
+                      <a:off x="0" y="0"/>
+                      <a:ext cx="5486400" cy="5880295"/>
+                    </a:xfrm>
+                    <a:prstGeom prst="rect"/>
+                  </pic:spPr>
+                </pic:pic>
+              </a:graphicData>
+            </a:graphic>
+          </wp:inline>
+        </w:drawing>
+      </w:r>
+    </w:p>
+    <w:p>
+      <w:pPr>
+        <w:jc w:val="center"/>
+      </w:pPr>
+      <w:r>
+        <w:rPr>
+          <w:i/>
+          <w:sz w:val="18"/>
+        </w:rPr>
+        <w:t>Step 25 - Google &amp; YouTube app conversion settings - separate from GA4, controls Google Ads only</w:t>
+      </w:r>
+    </w:p>
+    <w:p/>
     <w:p>
       <w:pPr>
         <w:pStyle w:val="Heading2"/>
       </w:pPr>
       <w:r>
-        <w:t>Fix Applied - 28 Oct 2026 at 12:27</w:t>
+        <w:t>Step 26 - Fix Applied: GA4 Measurement ID Removed from Infinite Google Ads</w:t>
       </w:r>
     </w:p>
     <w:p>
       <w:r>
         <w:t>Location: Shopify &gt; Apps &gt; Infinite Google Ads &gt; Settings &gt; Setup GA4</w:t>
         <w:br/>
-        <w:t>Action: Clicked trash icon next to G-YXN7NVRK1K &gt; Saved</w:t>
         <w:br/>
-        <w:t>Result: Measurement ID field now empty - Infinite Google Ads no longer sends purchase events to GA4</w:t>
+        <w:t>Action taken on 28 Oct 2026 at 12:27:</w:t>
+        <w:br/>
+        <w:t>Clicked the trash icon next to G-YXN7NVRK1K in the Measurement Id field &gt; Saved.</w:t>
         <w:br/>
         <w:br/>
-        <w:t>What was NOT affected:</w:t>
+        <w:t>Result: Measurement Id field is now empty. Infinite Google Ads will no longer send purchase events to GA4.</w:t>
         <w:br/>
-        <w:t>- Google Ads pixel AW-904743911 - still active</w:t>
         <w:br/>
-        <w:t>- Purchase Label / InfinitePi server-side conversions (98k/month) - still active</w:t>
+        <w:t>What was NOT affected by this change:</w:t>
+        <w:br/>
+        <w:t>- Google Ads pixel AW-904743911 - still active and tracking</w:t>
+        <w:br/>
+        <w:t>- Purchase Label / InfinitePi server-side conversions (98k GBP/month) - still active</w:t>
         <w:br/>
         <w:t>- GTM container GTM-KJGF2S5Q - still active</w:t>
         <w:br/>
-        <w:t>- Google &amp; YouTube GA4 tracking - still active and correct</w:t>
+        <w:t>- Dynamic Remarketing Pixel - still active</w:t>
+        <w:br/>
+        <w:t>- Google &amp; YouTube app GA4 tracking - still active and correct</w:t>
         <w:br/>
         <w:br/>
-        <w:t>Verification: Check GA4 Explore (Transaction ID + Purchase Revenue) on 5 Nov 2026.</w:t>
+        <w:t>Only the duplicate GA4 purchase event from Infinite Google Ads was removed.</w:t>
+      </w:r>
+    </w:p>
+    <w:p>
+      <w:r>
+        <w:drawing>
+          <wp:inline xmlns:a="http://schemas.openxmlformats.org/drawingml/2006/main" xmlns:pic="http://schemas.openxmlformats.org/drawingml/2006/picture">
+            <wp:extent cx="5486400" cy="2845617"/>
+            <wp:docPr id="26" name="Picture 26"/>
+            <wp:cNvGraphicFramePr>
+              <a:graphicFrameLocks noChangeAspect="1"/>
+            </wp:cNvGraphicFramePr>
+            <a:graphic>
+              <a:graphicData uri="http://schemas.openxmlformats.org/drawingml/2006/picture">
+                <pic:pic>
+                  <pic:nvPicPr>
+                    <pic:cNvPr id="0" name="26-infinite-google-ads-ga4-field-empty.png"/>
+                    <pic:cNvPicPr/>
+                  </pic:nvPicPr>
+                  <pic:blipFill>
+                    <a:blip r:embed="rId34"/>
+                    <a:stretch>
+                      <a:fillRect/>
+                    </a:stretch>
+                  </pic:blipFill>
+                  <pic:spPr>
+                    <a:xfrm>
+                      <a:off x="0" y="0"/>
+                      <a:ext cx="5486400" cy="2845617"/>
+                    </a:xfrm>
+                    <a:prstGeom prst="rect"/>
+                  </pic:spPr>
+                </pic:pic>
+              </a:graphicData>
+            </a:graphic>
+          </wp:inline>
+        </w:drawing>
+      </w:r>
+    </w:p>
+    <w:p>
+      <w:pPr>
+        <w:jc w:val="center"/>
+      </w:pPr>
+      <w:r>
+        <w:rPr>
+          <w:i/>
+          <w:sz w:val="18"/>
+        </w:rPr>
+        <w:t>Step 26 - Fix applied: G-YXN7NVRK1K removed from Infinite Google Ads Setup GA4 field - field now empty</w:t>
+      </w:r>
+    </w:p>
+    <w:p/>
+    <w:p>
+      <w:pPr>
+        <w:pStyle w:val="Heading1"/>
+      </w:pPr>
+      <w:r>
+        <w:t>Verification Plan - Check on 5 Nov 2026</w:t>
+      </w:r>
+    </w:p>
+    <w:p>
+      <w:r>
+        <w:t>The fix was applied 28 Oct 2026. GA4 takes 24-48 hours to fully reflect changes.</w:t>
         <w:br/>
-        <w:t>Expected: UUID rows gone, GA4 revenue close to Shopify revenue.</w:t>
+        <w:t>Check on 5 Nov 2026 (7 days after fix) for a clean verification window.</w:t>
+        <w:br/>
+        <w:br/>
+        <w:t>How to verify:</w:t>
+        <w:br/>
+        <w:t>1. Go to GA4 &gt; Explore &gt; create Free-form exploration</w:t>
+        <w:br/>
+        <w:t>2. Dimension: Transaction ID | Metric: Purchase revenue | Date: 29 Oct - 5 Nov</w:t>
+        <w:br/>
+        <w:t>3. Sort by revenue descending</w:t>
+        <w:br/>
+        <w:br/>
+        <w:t>Expected results if fix worked:</w:t>
+        <w:br/>
+        <w:t>- UUID rows (54cd..., 3223d..., d919d...) should be gone or near zero</w:t>
+        <w:br/>
+        <w:t>- Only numeric Shopify order IDs remaining</w:t>
+        <w:br/>
+        <w:t>- GA4 total revenue should be close to Shopify revenue (within 5-10%)</w:t>
+        <w:br/>
+        <w:br/>
+        <w:t>If UUID rows still appear on 5 Nov, further investigation of GTM container GTM-KJGF2S5Q will be required.</w:t>
       </w:r>
     </w:p>
     <w:p>
@@ -3264,7 +3741,7 @@
         <w:pStyle w:val="Heading1"/>
       </w:pPr>
       <w:r>
-        <w:t>Final Conclusion</w:t>
+        <w:t>Final Conclusion - All Checks</w:t>
       </w:r>
     </w:p>
     <w:tbl>
@@ -3274,13 +3751,14 @@
         <w:tblLook w:firstColumn="1" w:firstRow="1" w:lastColumn="0" w:lastRow="0" w:noHBand="0" w:noVBand="1" w:val="04A0"/>
       </w:tblPr>
       <w:tblGrid>
-        <w:gridCol w:w="4320"/>
-        <w:gridCol w:w="4320"/>
+        <w:gridCol w:w="2880"/>
+        <w:gridCol w:w="2880"/>
+        <w:gridCol w:w="2880"/>
       </w:tblGrid>
       <w:tr>
         <w:tc>
           <w:tcPr>
-            <w:tcW w:type="dxa" w:w="4320"/>
+            <w:tcW w:type="dxa" w:w="2880"/>
           </w:tcPr>
           <w:p>
             <w:r>
@@ -3290,7 +3768,7 @@
         </w:tc>
         <w:tc>
           <w:tcPr>
-            <w:tcW w:type="dxa" w:w="4320"/>
+            <w:tcW w:type="dxa" w:w="2880"/>
           </w:tcPr>
           <w:p>
             <w:r>
@@ -3298,11 +3776,21 @@
             </w:r>
           </w:p>
         </w:tc>
+        <w:tc>
+          <w:tcPr>
+            <w:tcW w:type="dxa" w:w="2880"/>
+          </w:tcPr>
+          <w:p>
+            <w:r>
+              <w:t>Status</w:t>
+            </w:r>
+          </w:p>
+        </w:tc>
       </w:tr>
       <w:tr>
         <w:tc>
           <w:tcPr>
-            <w:tcW w:type="dxa" w:w="4320"/>
+            <w:tcW w:type="dxa" w:w="2880"/>
           </w:tcPr>
           <w:p>
             <w:r>
@@ -3312,11 +3800,21 @@
         </w:tc>
         <w:tc>
           <w:tcPr>
-            <w:tcW w:type="dxa" w:w="4320"/>
+            <w:tcW w:type="dxa" w:w="2880"/>
           </w:tcPr>
           <w:p>
             <w:r>
-              <w:t>G-YXN7NVRK1K confirmed correct</w:t>
+              <w:t>G-YXN7NVRK1K confirmed in Google &amp; YouTube app</w:t>
+            </w:r>
+          </w:p>
+        </w:tc>
+        <w:tc>
+          <w:tcPr>
+            <w:tcW w:type="dxa" w:w="2880"/>
+          </w:tcPr>
+          <w:p>
+            <w:r>
+              <w:t>PASS</w:t>
             </w:r>
           </w:p>
         </w:tc>
@@ -3324,7 +3822,7 @@
       <w:tr>
         <w:tc>
           <w:tcPr>
-            <w:tcW w:type="dxa" w:w="4320"/>
+            <w:tcW w:type="dxa" w:w="2880"/>
           </w:tcPr>
           <w:p>
             <w:r>
@@ -3334,11 +3832,21 @@
         </w:tc>
         <w:tc>
           <w:tcPr>
-            <w:tcW w:type="dxa" w:w="4320"/>
+            <w:tcW w:type="dxa" w:w="2880"/>
           </w:tcPr>
           <w:p>
             <w:r>
-              <w:t>LEDSone neww (408110563) - active</w:t>
+              <w:t>LEDSone neww (408110563) - active and collecting</w:t>
+            </w:r>
+          </w:p>
+        </w:tc>
+        <w:tc>
+          <w:tcPr>
+            <w:tcW w:type="dxa" w:w="2880"/>
+          </w:tcPr>
+          <w:p>
+            <w:r>
+              <w:t>PASS</w:t>
             </w:r>
           </w:p>
         </w:tc>
@@ -3346,7 +3854,7 @@
       <w:tr>
         <w:tc>
           <w:tcPr>
-            <w:tcW w:type="dxa" w:w="4320"/>
+            <w:tcW w:type="dxa" w:w="2880"/>
           </w:tcPr>
           <w:p>
             <w:r>
@@ -3356,11 +3864,21 @@
         </w:tc>
         <w:tc>
           <w:tcPr>
-            <w:tcW w:type="dxa" w:w="4320"/>
+            <w:tcW w:type="dxa" w:w="2880"/>
           </w:tcPr>
           <w:p>
             <w:r>
-              <w:t>GA4 (31,128) &gt; GSC (18,700) - healthy</w:t>
+              <w:t>GA4 31,128 &gt; GSC 18,700 - healthy, includes all search engines</w:t>
+            </w:r>
+          </w:p>
+        </w:tc>
+        <w:tc>
+          <w:tcPr>
+            <w:tcW w:type="dxa" w:w="2880"/>
+          </w:tcPr>
+          <w:p>
+            <w:r>
+              <w:t>PASS</w:t>
             </w:r>
           </w:p>
         </w:tc>
@@ -3368,7 +3886,7 @@
       <w:tr>
         <w:tc>
           <w:tcPr>
-            <w:tcW w:type="dxa" w:w="4320"/>
+            <w:tcW w:type="dxa" w:w="2880"/>
           </w:tcPr>
           <w:p>
             <w:r>
@@ -3378,11 +3896,21 @@
         </w:tc>
         <w:tc>
           <w:tcPr>
-            <w:tcW w:type="dxa" w:w="4320"/>
+            <w:tcW w:type="dxa" w:w="2880"/>
           </w:tcPr>
           <w:p>
             <w:r>
-              <w:t>Confirmed - 5,680 items/week</w:t>
+              <w:t>5,680 items/week confirmed in E-commerce report</w:t>
+            </w:r>
+          </w:p>
+        </w:tc>
+        <w:tc>
+          <w:tcPr>
+            <w:tcW w:type="dxa" w:w="2880"/>
+          </w:tcPr>
+          <w:p>
+            <w:r>
+              <w:t>PASS</w:t>
             </w:r>
           </w:p>
         </w:tc>
@@ -3390,7 +3918,7 @@
       <w:tr>
         <w:tc>
           <w:tcPr>
-            <w:tcW w:type="dxa" w:w="4320"/>
+            <w:tcW w:type="dxa" w:w="2880"/>
           </w:tcPr>
           <w:p>
             <w:r>
@@ -3400,11 +3928,21 @@
         </w:tc>
         <w:tc>
           <w:tcPr>
-            <w:tcW w:type="dxa" w:w="4320"/>
+            <w:tcW w:type="dxa" w:w="2880"/>
           </w:tcPr>
           <w:p>
             <w:r>
-              <w:t>Numeric IDs confirmed (#LED70041 verified)</w:t>
+              <w:t>Numeric ID 13738544857474 = Order #LED70041 verified</w:t>
+            </w:r>
+          </w:p>
+        </w:tc>
+        <w:tc>
+          <w:tcPr>
+            <w:tcW w:type="dxa" w:w="2880"/>
+          </w:tcPr>
+          <w:p>
+            <w:r>
+              <w:t>PASS</w:t>
             </w:r>
           </w:p>
         </w:tc>
@@ -3412,21 +3950,31 @@
       <w:tr>
         <w:tc>
           <w:tcPr>
-            <w:tcW w:type="dxa" w:w="4320"/>
+            <w:tcW w:type="dxa" w:w="2880"/>
           </w:tcPr>
           <w:p>
             <w:r>
-              <w:t>84% Direct traffic</w:t>
+              <w:t>84% Direct traffic explained</w:t>
             </w:r>
           </w:p>
         </w:tc>
         <w:tc>
           <w:tcPr>
-            <w:tcW w:type="dxa" w:w="4320"/>
+            <w:tcW w:type="dxa" w:w="2880"/>
           </w:tcPr>
           <w:p>
             <w:r>
-              <w:t>Server-side tracking - intentional, working</w:t>
+              <w:t>Server-side tracking from Infinite Google Ads - intentional</w:t>
+            </w:r>
+          </w:p>
+        </w:tc>
+        <w:tc>
+          <w:tcPr>
+            <w:tcW w:type="dxa" w:w="2880"/>
+          </w:tcPr>
+          <w:p>
+            <w:r>
+              <w:t>PASS</w:t>
             </w:r>
           </w:p>
         </w:tc>
@@ -3434,7 +3982,7 @@
       <w:tr>
         <w:tc>
           <w:tcPr>
-            <w:tcW w:type="dxa" w:w="4320"/>
+            <w:tcW w:type="dxa" w:w="2880"/>
           </w:tcPr>
           <w:p>
             <w:r>
@@ -3444,11 +3992,21 @@
         </w:tc>
         <w:tc>
           <w:tcPr>
-            <w:tcW w:type="dxa" w:w="4320"/>
+            <w:tcW w:type="dxa" w:w="2880"/>
           </w:tcPr>
           <w:p>
             <w:r>
-              <w:t>2,842 extra purchases (98k) - unaffected by fix</w:t>
+              <w:t>2,842 extra purchases (98k GBP/month) - unaffected by fix</w:t>
+            </w:r>
+          </w:p>
+        </w:tc>
+        <w:tc>
+          <w:tcPr>
+            <w:tcW w:type="dxa" w:w="2880"/>
+          </w:tcPr>
+          <w:p>
+            <w:r>
+              <w:t>PASS</w:t>
             </w:r>
           </w:p>
         </w:tc>
@@ -3456,7 +4014,7 @@
       <w:tr>
         <w:tc>
           <w:tcPr>
-            <w:tcW w:type="dxa" w:w="4320"/>
+            <w:tcW w:type="dxa" w:w="2880"/>
           </w:tcPr>
           <w:p>
             <w:r>
@@ -3466,7 +4024,7 @@
         </w:tc>
         <w:tc>
           <w:tcPr>
-            <w:tcW w:type="dxa" w:w="4320"/>
+            <w:tcW w:type="dxa" w:w="2880"/>
           </w:tcPr>
           <w:p>
             <w:r>
@@ -3474,11 +4032,21 @@
             </w:r>
           </w:p>
         </w:tc>
+        <w:tc>
+          <w:tcPr>
+            <w:tcW w:type="dxa" w:w="2880"/>
+          </w:tcPr>
+          <w:p>
+            <w:r>
+              <w:t>PASS</w:t>
+            </w:r>
+          </w:p>
+        </w:tc>
       </w:tr>
       <w:tr>
         <w:tc>
           <w:tcPr>
-            <w:tcW w:type="dxa" w:w="4320"/>
+            <w:tcW w:type="dxa" w:w="2880"/>
           </w:tcPr>
           <w:p>
             <w:r>
@@ -3488,11 +4056,21 @@
         </w:tc>
         <w:tc>
           <w:tcPr>
-            <w:tcW w:type="dxa" w:w="4320"/>
+            <w:tcW w:type="dxa" w:w="2880"/>
           </w:tcPr>
           <w:p>
             <w:r>
-              <w:t>Clean - 1 hop only</w:t>
+              <w:t>Clean - 1 hop only (http to https)</w:t>
+            </w:r>
+          </w:p>
+        </w:tc>
+        <w:tc>
+          <w:tcPr>
+            <w:tcW w:type="dxa" w:w="2880"/>
+          </w:tcPr>
+          <w:p>
+            <w:r>
+              <w:t>PASS</w:t>
             </w:r>
           </w:p>
         </w:tc>
@@ -3500,21 +4078,31 @@
       <w:tr>
         <w:tc>
           <w:tcPr>
-            <w:tcW w:type="dxa" w:w="4320"/>
+            <w:tcW w:type="dxa" w:w="2880"/>
           </w:tcPr>
           <w:p>
             <w:r>
-              <w:t>GA4 double counting</w:t>
+              <w:t>GA4 double counting fixed</w:t>
             </w:r>
           </w:p>
         </w:tc>
         <w:tc>
           <w:tcPr>
-            <w:tcW w:type="dxa" w:w="4320"/>
+            <w:tcW w:type="dxa" w:w="2880"/>
           </w:tcPr>
           <w:p>
             <w:r>
-              <w:t>FIXED 28 Oct - removed GA4 ID from Infinite Google Ads</w:t>
+              <w:t>Removed G-YXN7NVRK1K from Infinite Google Ads 28 Oct 12:27</w:t>
+            </w:r>
+          </w:p>
+        </w:tc>
+        <w:tc>
+          <w:tcPr>
+            <w:tcW w:type="dxa" w:w="2880"/>
+          </w:tcPr>
+          <w:p>
+            <w:r>
+              <w:t>FIXED - verify 5 Nov</w:t>
             </w:r>
           </w:p>
         </w:tc>
@@ -3531,13 +4119,17 @@
     </w:p>
     <w:p>
       <w:r>
-        <w:t>Column I: DONE</w:t>
+        <w:t>Column I (Status): DONE</w:t>
         <w:br/>
         <w:br/>
-        <w:t>Column J: GA4 double counting fixed 28 Oct. Both Infinite Google Ads + Google &amp; YouTube were sending purchase events to GA4 (same ID G-YXN7NVRK1K) - every order counted twice. GA4 showed 66,938 vs Shopify 38,288 (7 days, 1.75x). Fix: removed GA4 measurement ID from Infinite Google Ads &gt; Setup GA4. Google Ads server-side tracking unaffected. Verify 5 Nov - UUID rows should disappear from GA4 transactions.</w:t>
+        <w:t>Column J (Note):</w:t>
+        <w:br/>
+        <w:t>GA4 double counting fixed 28 Oct. Both Infinite Google Ads + Google &amp; YouTube were sending purchase events to GA4 (same ID G-YXN7NVRK1K) - every order counted twice. GA4 showed 66,938 GBP vs Shopify 38,288 GBP (7 days, 1.75x overcounting). Fix: removed GA4 measurement ID from Infinite Google Ads &gt; Setup GA4 field. Google Ads server-side tracking (InfinitePi, 98k GBP/month) unaffected. Verify 5 Nov - UUID rows should disappear from GA4 transactions.</w:t>
         <w:br/>
         <w:br/>
-        <w:t>Column K: https://github.com/piranavakanandigitweblanka-lgtm/piranav_aios/blob/main/bot-tasks/C5-ga4-tracking/C5-GA4-Tracking-Investigation-2026-10-28-FINAL.docx</w:t>
+        <w:t>Column K (Proof link):</w:t>
+        <w:br/>
+        <w:t>https://github.com/piranavakanandigitweblanka-lgtm/piranav_aios/blob/main/bot-tasks/C5-ga4-tracking/C5-GA4-Tracking-Investigation-2026-10-28-FINAL.docx</w:t>
       </w:r>
     </w:p>
     <w:sectPr>

</xml_diff>